<commit_message>
Design_Docs: sync specs and yaml with the RTL and rulings (DOC-1)
CLIC ID map after INT-2/INT-3 (CLIC, DMA, TRM). APB windows 0-11, window 0 = SPI slave, MEMCTL in window 9 (AHB2APB,
  TRM, MEM). DMA channel 4. dmactive per D-18 (DEBUG). aon_clk and stretch clock per D-14 (CLKRST, TRM, yaml). PHYS 5.2 SDC
  sketch replaced by the rules of flow/constraints (AUD-4, PD-5). Dead spec/regs pointers. SPEC_TEMPLATE tooling status.
  .docx exports regenerated with pandoc. garuda_gen.py --check passes.

Co-Authored-By: Claude Opus 5.5 (1M context) <noreply@anthropic.com>
</commit_message>
<xml_diff>
--- a/Design_Docs/SPEC_TEMPLATE.docx
+++ b/Design_Docs/SPEC_TEMPLATE.docx
@@ -2,14 +2,15 @@
 <file path=word/document.xml><?xml version="1.0" encoding="utf-8"?>
 <w:document xmlns:w="http://schemas.openxmlformats.org/wordprocessingml/2006/main" xmlns:m="http://schemas.openxmlformats.org/officeDocument/2006/math" xmlns:r="http://schemas.openxmlformats.org/officeDocument/2006/relationships" xmlns:o="urn:schemas-microsoft-com:office:office" xmlns:v="urn:schemas-microsoft-com:vml" xmlns:w10="urn:schemas-microsoft-com:office:word" xmlns:a="http://schemas.openxmlformats.org/drawingml/2006/main" xmlns:pic="http://schemas.openxmlformats.org/drawingml/2006/picture" xmlns:wp="http://schemas.openxmlformats.org/drawingml/2006/wordprocessingDrawing">
   <w:body>
-    <w:bookmarkStart w:id="24" w:name="X08ac85855e44c6492779370203673ee2076d801"/>
     <w:p>
       <w:pPr>
         <w:pStyle w:val="Heading1"/>
       </w:pPr>
+      <w:bookmarkStart w:id="20" w:name="Xb5ab452fc41a4586cbb6267569f3059604a7e4a"/>
       <w:r>
         <w:t xml:space="preserve">GARUDA Block Design Specification — Template</w:t>
       </w:r>
+      <w:bookmarkEnd w:id="20"/>
     </w:p>
     <w:p>
       <w:pPr>
@@ -17,7 +18,6 @@
       </w:pPr>
       <w:r>
         <w:rPr>
-          <w:bCs/>
           <w:b/>
         </w:rPr>
         <w:t xml:space="preserve">GARUDA-DOC-001 Rev 1.0.</w:t>
@@ -41,14 +41,227 @@
         <w:t xml:space="preserve">to look, and a missing section is visible as a gap rather than hidden in prose.</w:t>
       </w:r>
     </w:p>
-    <w:bookmarkStart w:id="20" w:name="rules-that-apply-to-every-spec"/>
     <w:p>
       <w:pPr>
+        <w:pStyle w:val="BlockText"/>
+      </w:pPr>
+      <w:r>
+        <w:rPr>
+          <w:b/>
+        </w:rPr>
+        <w:t xml:space="preserve">Status of the tooling this template names (2026-10-14).</w:t>
+      </w:r>
+      <w:r>
+        <w:t xml:space="preserve"> </w:t>
+      </w:r>
+      <w:r>
+        <w:rPr>
+          <w:rStyle w:val="VerbatimChar"/>
+        </w:rPr>
+        <w:t xml:space="preserve">gen/tables.md</w:t>
+      </w:r>
+      <w:r>
+        <w:t xml:space="preserve">,</w:t>
+      </w:r>
+      <w:r>
+        <w:t xml:space="preserve"> </w:t>
+      </w:r>
+      <w:r>
+        <w:rPr>
+          <w:rStyle w:val="VerbatimChar"/>
+        </w:rPr>
+        <w:t xml:space="preserve">tools/check_specs.py</w:t>
+      </w:r>
+      <w:r>
+        <w:t xml:space="preserve"> </w:t>
+      </w:r>
+      <w:r>
+        <w:t xml:space="preserve">and</w:t>
+      </w:r>
+      <w:r>
+        <w:t xml:space="preserve"> </w:t>
+      </w:r>
+      <w:r>
+        <w:rPr>
+          <w:rStyle w:val="VerbatimChar"/>
+        </w:rPr>
+        <w:t xml:space="preserve">spec/regs/&lt;block&gt;.yaml</w:t>
+      </w:r>
+      <w:r>
+        <w:t xml:space="preserve"> </w:t>
+      </w:r>
+      <w:r>
+        <w:t xml:space="preserve">were planned and do not exist.</w:t>
+      </w:r>
+      <w:r>
+        <w:t xml:space="preserve"> </w:t>
+      </w:r>
+      <w:r>
+        <w:t xml:space="preserve">What exists:</w:t>
+      </w:r>
+      <w:r>
+        <w:t xml:space="preserve"> </w:t>
+      </w:r>
+      <w:r>
+        <w:rPr>
+          <w:rStyle w:val="VerbatimChar"/>
+        </w:rPr>
+        <w:t xml:space="preserve">Design_Docs/garuda_system.yaml</w:t>
+      </w:r>
+      <w:r>
+        <w:t xml:space="preserve"> </w:t>
+      </w:r>
+      <w:r>
+        <w:t xml:space="preserve">with</w:t>
+      </w:r>
+      <w:r>
+        <w:t xml:space="preserve"> </w:t>
+      </w:r>
+      <w:r>
+        <w:rPr>
+          <w:rStyle w:val="VerbatimChar"/>
+        </w:rPr>
+        <w:t xml:space="preserve">tools/garuda_gen.py</w:t>
+      </w:r>
+      <w:r>
+        <w:t xml:space="preserve"> </w:t>
+      </w:r>
+      <w:r>
+        <w:t xml:space="preserve">(address map,</w:t>
+      </w:r>
+      <w:r>
+        <w:t xml:space="preserve"> </w:t>
+      </w:r>
+      <w:r>
+        <w:t xml:space="preserve">windows, CLIC IDs and DMA channels into</w:t>
+      </w:r>
+      <w:r>
+        <w:t xml:space="preserve"> </w:t>
+      </w:r>
+      <w:r>
+        <w:rPr>
+          <w:rStyle w:val="VerbatimChar"/>
+        </w:rPr>
+        <w:t xml:space="preserve">rtl/include/garuda_map.vh</w:t>
+      </w:r>
+      <w:r>
+        <w:t xml:space="preserve"> </w:t>
+      </w:r>
+      <w:r>
+        <w:t xml:space="preserve">and</w:t>
+      </w:r>
+      <w:r>
+        <w:t xml:space="preserve"> </w:t>
+      </w:r>
+      <w:r>
+        <w:rPr>
+          <w:rStyle w:val="VerbatimChar"/>
+        </w:rPr>
+        <w:t xml:space="preserve">sw/common/garuda_map.h</w:t>
+      </w:r>
+      <w:r>
+        <w:t xml:space="preserve">;</w:t>
+      </w:r>
+      <w:r>
+        <w:t xml:space="preserve"> </w:t>
+      </w:r>
+      <w:r>
+        <w:rPr>
+          <w:rStyle w:val="VerbatimChar"/>
+        </w:rPr>
+        <w:t xml:space="preserve">--check</w:t>
+      </w:r>
+      <w:r>
+        <w:t xml:space="preserve"> </w:t>
+      </w:r>
+      <w:r>
+        <w:t xml:space="preserve">fails on drift); SystemRDL register descriptions in</w:t>
+      </w:r>
+      <w:r>
+        <w:t xml:space="preserve"> </w:t>
+      </w:r>
+      <w:r>
+        <w:rPr>
+          <w:rStyle w:val="VerbatimChar"/>
+        </w:rPr>
+        <w:t xml:space="preserve">Design_Docs/regs/</w:t>
+      </w:r>
+      <w:r>
+        <w:t xml:space="preserve"> </w:t>
+      </w:r>
+      <w:r>
+        <w:t xml:space="preserve">for the CLIC, clock/reset, GPIO, PWM and timers, written from each</w:t>
+      </w:r>
+      <w:r>
+        <w:t xml:space="preserve"> </w:t>
+      </w:r>
+      <w:r>
+        <w:t xml:space="preserve">spec's §6 and used to generate the UVM register models (</w:t>
+      </w:r>
+      <w:r>
+        <w:rPr>
+          <w:rStyle w:val="VerbatimChar"/>
+        </w:rPr>
+        <w:t xml:space="preserve">tools/gen/gen_ral.py</w:t>
+      </w:r>
+      <w:r>
+        <w:t xml:space="preserve">); and</w:t>
+      </w:r>
+      <w:r>
+        <w:t xml:space="preserve"> </w:t>
+      </w:r>
+      <w:r>
+        <w:rPr>
+          <w:rStyle w:val="VerbatimChar"/>
+        </w:rPr>
+        <w:t xml:space="preserve">tools/check_docs.py</w:t>
+      </w:r>
+      <w:r>
+        <w:t xml:space="preserve"> </w:t>
+      </w:r>
+      <w:r>
+        <w:t xml:space="preserve">(</w:t>
+      </w:r>
+      <w:r>
+        <w:rPr>
+          <w:rStyle w:val="VerbatimChar"/>
+        </w:rPr>
+        <w:t xml:space="preserve">make check_docs</w:t>
+      </w:r>
+      <w:r>
+        <w:t xml:space="preserve">) for</w:t>
+      </w:r>
+      <w:r>
+        <w:t xml:space="preserve"> </w:t>
+      </w:r>
+      <w:r>
+        <w:rPr>
+          <w:rStyle w:val="VerbatimChar"/>
+        </w:rPr>
+        <w:t xml:space="preserve">.docx</w:t>
+      </w:r>
+      <w:r>
+        <w:t xml:space="preserve"> </w:t>
+      </w:r>
+      <w:r>
+        <w:t xml:space="preserve">exports. Rules 1 and the register</w:t>
+      </w:r>
+      <w:r>
+        <w:t xml:space="preserve"> </w:t>
+      </w:r>
+      <w:r>
+        <w:t xml:space="preserve">generation in "Machine-readable sources" below are therefore targets, not checks.</w:t>
+      </w:r>
+    </w:p>
+    <w:p>
+      <w:pPr>
         <w:pStyle w:val="Heading2"/>
       </w:pPr>
+      <w:bookmarkStart w:id="21" w:name="rules-that-apply-to-every-spec"/>
       <w:r>
         <w:t xml:space="preserve">Rules that apply to every spec</w:t>
       </w:r>
+      <w:bookmarkEnd w:id="21"/>
     </w:p>
     <w:p>
       <w:pPr>
@@ -60,7 +273,6 @@
       </w:pPr>
       <w:r>
         <w:rPr>
-          <w:bCs/>
           <w:b/>
         </w:rPr>
         <w:t xml:space="preserve">No cross-block facts are written by hand.</w:t>
@@ -102,7 +314,7 @@
         <w:t xml:space="preserve">{{include: gen/tables.md#T-n}}</w:t>
       </w:r>
       <w:r>
-        <w:t xml:space="preserve">. If a value appears literally in a spec’s prose, that</w:t>
+        <w:t xml:space="preserve">. If a value appears literally in a spec's prose, that</w:t>
       </w:r>
       <w:r>
         <w:t xml:space="preserve"> </w:t>
@@ -136,7 +348,6 @@
       </w:pPr>
       <w:r>
         <w:rPr>
-          <w:bCs/>
           <w:b/>
         </w:rPr>
         <w:t xml:space="preserve">No edit history in the body.</w:t>
@@ -145,37 +356,7 @@
         <w:t xml:space="preserve"> </w:t>
       </w:r>
       <w:r>
-        <w:t xml:space="preserve">No</w:t>
-      </w:r>
-      <w:r>
-        <w:t xml:space="preserve"> </w:t>
-      </w:r>
-      <w:r>
-        <w:t xml:space="preserve">“</w:t>
-      </w:r>
-      <w:r>
-        <w:t xml:space="preserve">(was 200 MHz)</w:t>
-      </w:r>
-      <w:r>
-        <w:t xml:space="preserve">”</w:t>
-      </w:r>
-      <w:r>
-        <w:t xml:space="preserve">, no</w:t>
-      </w:r>
-      <w:r>
-        <w:t xml:space="preserve"> </w:t>
-      </w:r>
-      <w:r>
-        <w:t xml:space="preserve">“</w:t>
-      </w:r>
-      <w:r>
-        <w:t xml:space="preserve">corrected from</w:t>
-      </w:r>
-      <w:r>
-        <w:t xml:space="preserve">”</w:t>
-      </w:r>
-      <w:r>
-        <w:t xml:space="preserve">. History lives</w:t>
+        <w:t xml:space="preserve">No "(was 200 MHz)", no "corrected from". History lives</w:t>
       </w:r>
       <w:r>
         <w:t xml:space="preserve"> </w:t>
@@ -194,7 +375,6 @@
       </w:pPr>
       <w:r>
         <w:rPr>
-          <w:bCs/>
           <w:b/>
         </w:rPr>
         <w:t xml:space="preserve">Every normative statement is numbered and testable.</w:t>
@@ -212,7 +392,7 @@
         <w:t xml:space="preserve"> </w:t>
       </w:r>
       <w:r>
-        <w:t xml:space="preserve">style. Section 11’s</w:t>
+        <w:t xml:space="preserve">style. Section 11's</w:t>
       </w:r>
       <w:r>
         <w:t xml:space="preserve"> </w:t>
@@ -231,7 +411,6 @@
       </w:pPr>
       <w:r>
         <w:rPr>
-          <w:bCs/>
           <w:b/>
         </w:rPr>
         <w:t xml:space="preserve">Every design choice points at an ADR.</w:t>
@@ -259,7 +438,6 @@
       </w:pPr>
       <w:r>
         <w:rPr>
-          <w:bCs/>
           <w:b/>
         </w:rPr>
         <w:t xml:space="preserve">Timing is drawn, not described.</w:t>
@@ -293,7 +471,6 @@
       </w:pPr>
       <w:r>
         <w:rPr>
-          <w:bCs/>
           <w:b/>
         </w:rPr>
         <w:t xml:space="preserve">Assertions are in the spec, in SVA.</w:t>
@@ -311,34 +488,34 @@
         <w:t xml:space="preserve">binds. The spec is the source; the testbench imports it.</w:t>
       </w:r>
     </w:p>
-    <w:bookmarkEnd w:id="20"/>
-    <w:bookmarkStart w:id="21" w:name="section-structure"/>
     <w:p>
       <w:pPr>
         <w:pStyle w:val="Heading2"/>
       </w:pPr>
+      <w:bookmarkStart w:id="22" w:name="section-structure"/>
       <w:r>
         <w:t xml:space="preserve">Section structure</w:t>
       </w:r>
+      <w:bookmarkEnd w:id="22"/>
     </w:p>
     <w:tbl>
       <w:tblPr>
         <w:tblStyle w:val="Table"/>
-        <w:tblW w:type="pct" w:w="5000"/>
-        <w:tblLook w:firstRow="1" w:lastRow="0" w:firstColumn="0" w:lastColumn="0" w:noHBand="0" w:noVBand="0" w:val="0020"/>
-        <w:jc w:val="start"/>
+        <w:tblW w:type="pct" w:w="0.0"/>
+        <w:tblLook w:firstRow="1"/>
       </w:tblPr>
-      <w:tblGrid>
-        <w:gridCol w:w="2640"/>
-        <w:gridCol w:w="2640"/>
-        <w:gridCol w:w="2640"/>
-      </w:tblGrid>
+      <w:tblGrid/>
       <w:tr>
         <w:trPr>
-          <w:tblHeader w:val="true"/>
+          <w:cnfStyle w:firstRow="1"/>
         </w:trPr>
         <w:tc>
-          <w:tcPr/>
+          <w:tcPr>
+            <w:tcBorders>
+              <w:bottom w:val="single"/>
+            </w:tcBorders>
+            <w:vAlign w:val="bottom"/>
+          </w:tcPr>
           <w:p>
             <w:pPr>
               <w:pStyle w:val="Compact"/>
@@ -350,7 +527,12 @@
           </w:p>
         </w:tc>
         <w:tc>
-          <w:tcPr/>
+          <w:tcPr>
+            <w:tcBorders>
+              <w:bottom w:val="single"/>
+            </w:tcBorders>
+            <w:vAlign w:val="bottom"/>
+          </w:tcPr>
           <w:p>
             <w:pPr>
               <w:pStyle w:val="Compact"/>
@@ -362,7 +544,12 @@
           </w:p>
         </w:tc>
         <w:tc>
-          <w:tcPr/>
+          <w:tcPr>
+            <w:tcBorders>
+              <w:bottom w:val="single"/>
+            </w:tcBorders>
+            <w:vAlign w:val="bottom"/>
+          </w:tcPr>
           <w:p>
             <w:pPr>
               <w:pStyle w:val="Compact"/>
@@ -376,7 +563,6 @@
       </w:tr>
       <w:tr>
         <w:tc>
-          <w:tcPr/>
           <w:p>
             <w:pPr>
               <w:pStyle w:val="Compact"/>
@@ -388,7 +574,6 @@
           </w:p>
         </w:tc>
         <w:tc>
-          <w:tcPr/>
           <w:p>
             <w:pPr>
               <w:pStyle w:val="Compact"/>
@@ -400,7 +585,6 @@
           </w:p>
         </w:tc>
         <w:tc>
-          <w:tcPr/>
           <w:p>
             <w:pPr>
               <w:pStyle w:val="Compact"/>
@@ -414,7 +598,6 @@
       </w:tr>
       <w:tr>
         <w:tc>
-          <w:tcPr/>
           <w:p>
             <w:pPr>
               <w:pStyle w:val="Compact"/>
@@ -426,7 +609,6 @@
           </w:p>
         </w:tc>
         <w:tc>
-          <w:tcPr/>
           <w:p>
             <w:pPr>
               <w:pStyle w:val="Compact"/>
@@ -438,7 +620,6 @@
           </w:p>
         </w:tc>
         <w:tc>
-          <w:tcPr/>
           <w:p>
             <w:pPr>
               <w:pStyle w:val="Compact"/>
@@ -452,7 +633,6 @@
       </w:tr>
       <w:tr>
         <w:tc>
-          <w:tcPr/>
           <w:p>
             <w:pPr>
               <w:pStyle w:val="Compact"/>
@@ -464,7 +644,6 @@
           </w:p>
         </w:tc>
         <w:tc>
-          <w:tcPr/>
           <w:p>
             <w:pPr>
               <w:pStyle w:val="Compact"/>
@@ -476,7 +655,6 @@
           </w:p>
         </w:tc>
         <w:tc>
-          <w:tcPr/>
           <w:p>
             <w:pPr>
               <w:pStyle w:val="Compact"/>
@@ -505,7 +683,6 @@
       </w:tr>
       <w:tr>
         <w:tc>
-          <w:tcPr/>
           <w:p>
             <w:pPr>
               <w:pStyle w:val="Compact"/>
@@ -517,7 +694,6 @@
           </w:p>
         </w:tc>
         <w:tc>
-          <w:tcPr/>
           <w:p>
             <w:pPr>
               <w:pStyle w:val="Compact"/>
@@ -529,7 +705,6 @@
           </w:p>
         </w:tc>
         <w:tc>
-          <w:tcPr/>
           <w:p>
             <w:pPr>
               <w:pStyle w:val="Compact"/>
@@ -543,7 +718,6 @@
       </w:tr>
       <w:tr>
         <w:tc>
-          <w:tcPr/>
           <w:p>
             <w:pPr>
               <w:pStyle w:val="Compact"/>
@@ -555,7 +729,6 @@
           </w:p>
         </w:tc>
         <w:tc>
-          <w:tcPr/>
           <w:p>
             <w:pPr>
               <w:pStyle w:val="Compact"/>
@@ -567,7 +740,6 @@
           </w:p>
         </w:tc>
         <w:tc>
-          <w:tcPr/>
           <w:p>
             <w:pPr>
               <w:pStyle w:val="Compact"/>
@@ -590,7 +762,6 @@
       </w:tr>
       <w:tr>
         <w:tc>
-          <w:tcPr/>
           <w:p>
             <w:pPr>
               <w:pStyle w:val="Compact"/>
@@ -602,7 +773,6 @@
           </w:p>
         </w:tc>
         <w:tc>
-          <w:tcPr/>
           <w:p>
             <w:pPr>
               <w:pStyle w:val="Compact"/>
@@ -614,7 +784,6 @@
           </w:p>
         </w:tc>
         <w:tc>
-          <w:tcPr/>
           <w:p>
             <w:pPr>
               <w:pStyle w:val="Compact"/>
@@ -628,7 +797,6 @@
       </w:tr>
       <w:tr>
         <w:tc>
-          <w:tcPr/>
           <w:p>
             <w:pPr>
               <w:pStyle w:val="Compact"/>
@@ -640,7 +808,6 @@
           </w:p>
         </w:tc>
         <w:tc>
-          <w:tcPr/>
           <w:p>
             <w:pPr>
               <w:pStyle w:val="Compact"/>
@@ -652,7 +819,6 @@
           </w:p>
         </w:tc>
         <w:tc>
-          <w:tcPr/>
           <w:p>
             <w:pPr>
               <w:pStyle w:val="Compact"/>
@@ -666,7 +832,6 @@
       </w:tr>
       <w:tr>
         <w:tc>
-          <w:tcPr/>
           <w:p>
             <w:pPr>
               <w:pStyle w:val="Compact"/>
@@ -678,7 +843,6 @@
           </w:p>
         </w:tc>
         <w:tc>
-          <w:tcPr/>
           <w:p>
             <w:pPr>
               <w:pStyle w:val="Compact"/>
@@ -690,7 +854,6 @@
           </w:p>
         </w:tc>
         <w:tc>
-          <w:tcPr/>
           <w:p>
             <w:pPr>
               <w:pStyle w:val="Compact"/>
@@ -704,7 +867,6 @@
       </w:tr>
       <w:tr>
         <w:tc>
-          <w:tcPr/>
           <w:p>
             <w:pPr>
               <w:pStyle w:val="Compact"/>
@@ -716,7 +878,6 @@
           </w:p>
         </w:tc>
         <w:tc>
-          <w:tcPr/>
           <w:p>
             <w:pPr>
               <w:pStyle w:val="Compact"/>
@@ -728,7 +889,6 @@
           </w:p>
         </w:tc>
         <w:tc>
-          <w:tcPr/>
           <w:p>
             <w:pPr>
               <w:pStyle w:val="Compact"/>
@@ -751,7 +911,6 @@
       </w:tr>
       <w:tr>
         <w:tc>
-          <w:tcPr/>
           <w:p>
             <w:pPr>
               <w:pStyle w:val="Compact"/>
@@ -763,7 +922,6 @@
           </w:p>
         </w:tc>
         <w:tc>
-          <w:tcPr/>
           <w:p>
             <w:pPr>
               <w:pStyle w:val="Compact"/>
@@ -775,7 +933,6 @@
           </w:p>
         </w:tc>
         <w:tc>
-          <w:tcPr/>
           <w:p>
             <w:pPr>
               <w:pStyle w:val="Compact"/>
@@ -798,7 +955,6 @@
       </w:tr>
       <w:tr>
         <w:tc>
-          <w:tcPr/>
           <w:p>
             <w:pPr>
               <w:pStyle w:val="Compact"/>
@@ -810,7 +966,6 @@
           </w:p>
         </w:tc>
         <w:tc>
-          <w:tcPr/>
           <w:p>
             <w:pPr>
               <w:pStyle w:val="Compact"/>
@@ -822,7 +977,6 @@
           </w:p>
         </w:tc>
         <w:tc>
-          <w:tcPr/>
           <w:p>
             <w:pPr>
               <w:pStyle w:val="Compact"/>
@@ -836,7 +990,6 @@
       </w:tr>
       <w:tr>
         <w:tc>
-          <w:tcPr/>
           <w:p>
             <w:pPr>
               <w:pStyle w:val="Compact"/>
@@ -848,7 +1001,6 @@
           </w:p>
         </w:tc>
         <w:tc>
-          <w:tcPr/>
           <w:p>
             <w:pPr>
               <w:pStyle w:val="Compact"/>
@@ -860,7 +1012,6 @@
           </w:p>
         </w:tc>
         <w:tc>
-          <w:tcPr/>
           <w:p>
             <w:pPr>
               <w:pStyle w:val="Compact"/>
@@ -874,7 +1025,6 @@
       </w:tr>
       <w:tr>
         <w:tc>
-          <w:tcPr/>
           <w:p>
             <w:pPr>
               <w:pStyle w:val="Compact"/>
@@ -886,7 +1036,6 @@
           </w:p>
         </w:tc>
         <w:tc>
-          <w:tcPr/>
           <w:p>
             <w:pPr>
               <w:pStyle w:val="Compact"/>
@@ -898,7 +1047,6 @@
           </w:p>
         </w:tc>
         <w:tc>
-          <w:tcPr/>
           <w:p>
             <w:pPr>
               <w:pStyle w:val="Compact"/>
@@ -921,7 +1069,6 @@
       </w:tr>
       <w:tr>
         <w:tc>
-          <w:tcPr/>
           <w:p>
             <w:pPr>
               <w:pStyle w:val="Compact"/>
@@ -933,7 +1080,6 @@
           </w:p>
         </w:tc>
         <w:tc>
-          <w:tcPr/>
           <w:p>
             <w:pPr>
               <w:pStyle w:val="Compact"/>
@@ -945,7 +1091,6 @@
           </w:p>
         </w:tc>
         <w:tc>
-          <w:tcPr/>
           <w:p>
             <w:pPr>
               <w:pStyle w:val="Compact"/>
@@ -959,7 +1104,6 @@
       </w:tr>
       <w:tr>
         <w:tc>
-          <w:tcPr/>
           <w:p>
             <w:pPr>
               <w:pStyle w:val="Compact"/>
@@ -971,7 +1115,6 @@
           </w:p>
         </w:tc>
         <w:tc>
-          <w:tcPr/>
           <w:p>
             <w:pPr>
               <w:pStyle w:val="Compact"/>
@@ -983,7 +1126,6 @@
           </w:p>
         </w:tc>
         <w:tc>
-          <w:tcPr/>
           <w:p>
             <w:pPr>
               <w:pStyle w:val="Compact"/>
@@ -997,7 +1139,6 @@
       </w:tr>
       <w:tr>
         <w:tc>
-          <w:tcPr/>
           <w:p>
             <w:pPr>
               <w:pStyle w:val="Compact"/>
@@ -1009,7 +1150,6 @@
           </w:p>
         </w:tc>
         <w:tc>
-          <w:tcPr/>
           <w:p>
             <w:pPr>
               <w:pStyle w:val="Compact"/>
@@ -1021,7 +1161,6 @@
           </w:p>
         </w:tc>
         <w:tc>
-          <w:tcPr/>
           <w:p>
             <w:pPr>
               <w:pStyle w:val="Compact"/>
@@ -1035,7 +1174,6 @@
       </w:tr>
       <w:tr>
         <w:tc>
-          <w:tcPr/>
           <w:p>
             <w:pPr>
               <w:pStyle w:val="Compact"/>
@@ -1047,7 +1185,6 @@
           </w:p>
         </w:tc>
         <w:tc>
-          <w:tcPr/>
           <w:p>
             <w:pPr>
               <w:pStyle w:val="Compact"/>
@@ -1059,7 +1196,6 @@
           </w:p>
         </w:tc>
         <w:tc>
-          <w:tcPr/>
           <w:p>
             <w:pPr>
               <w:pStyle w:val="Compact"/>
@@ -1082,7 +1218,6 @@
       </w:tr>
       <w:tr>
         <w:tc>
-          <w:tcPr/>
           <w:p>
             <w:pPr>
               <w:pStyle w:val="Compact"/>
@@ -1094,7 +1229,6 @@
           </w:p>
         </w:tc>
         <w:tc>
-          <w:tcPr/>
           <w:p>
             <w:pPr>
               <w:pStyle w:val="Compact"/>
@@ -1106,7 +1240,6 @@
           </w:p>
         </w:tc>
         <w:tc>
-          <w:tcPr/>
           <w:p>
             <w:pPr>
               <w:pStyle w:val="Compact"/>
@@ -1119,15 +1252,15 @@
         </w:tc>
       </w:tr>
     </w:tbl>
-    <w:bookmarkEnd w:id="21"/>
-    <w:bookmarkStart w:id="22" w:name="machine-readability"/>
     <w:p>
       <w:pPr>
         <w:pStyle w:val="Heading2"/>
       </w:pPr>
+      <w:bookmarkStart w:id="23" w:name="machine-readability"/>
       <w:r>
         <w:t xml:space="preserve">Machine readability</w:t>
       </w:r>
+      <w:bookmarkEnd w:id="23"/>
     </w:p>
     <w:p>
       <w:pPr>
@@ -1167,7 +1300,7 @@
         <w:t xml:space="preserve"> </w:t>
       </w:r>
       <w:r>
-        <w:t xml:space="preserve">bank’s field decode,</w:t>
+        <w:t xml:space="preserve">bank's field decode,</w:t>
       </w:r>
       <w:r>
         <w:t xml:space="preserve"> </w:t>
@@ -1272,15 +1405,15 @@
         <w:t xml:space="preserve">Makefile, so a requirement cannot silently have no test.</w:t>
       </w:r>
     </w:p>
-    <w:bookmarkEnd w:id="22"/>
-    <w:bookmarkStart w:id="23" w:name="human-readability"/>
     <w:p>
       <w:pPr>
         <w:pStyle w:val="Heading2"/>
       </w:pPr>
+      <w:bookmarkStart w:id="24" w:name="human-readability"/>
       <w:r>
         <w:t xml:space="preserve">Human readability</w:t>
       </w:r>
+      <w:bookmarkEnd w:id="24"/>
     </w:p>
     <w:p>
       <w:pPr>
@@ -1336,8 +1469,6 @@
         <w:t xml:space="preserve">No section exceeds two screens without a table or a waveform breaking it up.</w:t>
       </w:r>
     </w:p>
-    <w:bookmarkEnd w:id="23"/>
-    <w:bookmarkEnd w:id="24"/>
     <w:sectPr/>
   </w:body>
 </w:document>
@@ -1369,14 +1500,17 @@
 <file path=word/numbering.xml><?xml version="1.0" encoding="utf-8"?>
 <w:numbering xmlns:w="http://schemas.openxmlformats.org/wordprocessingml/2006/main">
   <w:abstractNum w:abstractNumId="990">
-    <w:nsid w:val="A990"/>
+    <w:nsid w:val="2c1ae401"/>
     <w:multiLevelType w:val="multilevel"/>
     <w:lvl w:ilvl="0">
       <w:numFmt w:val="bullet"/>
       <w:lvlText w:val=" "/>
       <w:lvlJc w:val="left"/>
       <w:pPr>
-        <w:ind w:left="720" w:hanging="480"/>
+        <w:tabs>
+          <w:tab w:val="num" w:pos="0"/>
+        </w:tabs>
+        <w:ind w:left="480" w:hanging="480"/>
       </w:pPr>
     </w:lvl>
     <w:lvl w:ilvl="1">
@@ -1384,7 +1518,10 @@
       <w:lvlText w:val=" "/>
       <w:lvlJc w:val="left"/>
       <w:pPr>
-        <w:ind w:left="1440" w:hanging="480"/>
+        <w:tabs>
+          <w:tab w:val="num" w:pos="720"/>
+        </w:tabs>
+        <w:ind w:left="1200" w:hanging="480"/>
       </w:pPr>
     </w:lvl>
     <w:lvl w:ilvl="2">
@@ -1392,7 +1529,10 @@
       <w:lvlText w:val=" "/>
       <w:lvlJc w:val="left"/>
       <w:pPr>
-        <w:ind w:left="2160" w:hanging="480"/>
+        <w:tabs>
+          <w:tab w:val="num" w:pos="1440"/>
+        </w:tabs>
+        <w:ind w:left="1920" w:hanging="480"/>
       </w:pPr>
     </w:lvl>
     <w:lvl w:ilvl="3">
@@ -1400,7 +1540,10 @@
       <w:lvlText w:val=" "/>
       <w:lvlJc w:val="left"/>
       <w:pPr>
-        <w:ind w:left="2880" w:hanging="480"/>
+        <w:tabs>
+          <w:tab w:val="num" w:pos="2160"/>
+        </w:tabs>
+        <w:ind w:left="2640" w:hanging="480"/>
       </w:pPr>
     </w:lvl>
     <w:lvl w:ilvl="4">
@@ -1408,7 +1551,10 @@
       <w:lvlText w:val=" "/>
       <w:lvlJc w:val="left"/>
       <w:pPr>
-        <w:ind w:left="3600" w:hanging="480"/>
+        <w:tabs>
+          <w:tab w:val="num" w:pos="2880"/>
+        </w:tabs>
+        <w:ind w:left="3360" w:hanging="480"/>
       </w:pPr>
     </w:lvl>
     <w:lvl w:ilvl="5">
@@ -1416,7 +1562,10 @@
       <w:lvlText w:val=" "/>
       <w:lvlJc w:val="left"/>
       <w:pPr>
-        <w:ind w:left="4320" w:hanging="480"/>
+        <w:tabs>
+          <w:tab w:val="num" w:pos="3600"/>
+        </w:tabs>
+        <w:ind w:left="4080" w:hanging="480"/>
       </w:pPr>
     </w:lvl>
     <w:lvl w:ilvl="6">
@@ -1424,7 +1573,10 @@
       <w:lvlText w:val=" "/>
       <w:lvlJc w:val="left"/>
       <w:pPr>
-        <w:ind w:left="5040" w:hanging="480"/>
+        <w:tabs>
+          <w:tab w:val="num" w:pos="4320"/>
+        </w:tabs>
+        <w:ind w:left="4800" w:hanging="480"/>
       </w:pPr>
     </w:lvl>
     <w:lvl w:ilvl="7">
@@ -1432,7 +1584,10 @@
       <w:lvlText w:val=" "/>
       <w:lvlJc w:val="left"/>
       <w:pPr>
-        <w:ind w:left="5760" w:hanging="480"/>
+        <w:tabs>
+          <w:tab w:val="num" w:pos="5040"/>
+        </w:tabs>
+        <w:ind w:left="5520" w:hanging="480"/>
       </w:pPr>
     </w:lvl>
     <w:lvl w:ilvl="8">
@@ -1440,12 +1595,15 @@
       <w:lvlText w:val=" "/>
       <w:lvlJc w:val="left"/>
       <w:pPr>
-        <w:ind w:left="6480" w:hanging="480"/>
+        <w:tabs>
+          <w:tab w:val="num" w:pos="5760"/>
+        </w:tabs>
+        <w:ind w:left="6240" w:hanging="480"/>
       </w:pPr>
     </w:lvl>
   </w:abstractNum>
-  <w:abstractNum w:abstractNumId="99411">
-    <w:nsid w:val="A99411"/>
+  <w:abstractNum w:abstractNumId="99211">
+    <w:nsid w:val="ea454b4c"/>
     <w:multiLevelType w:val="multilevel"/>
     <w:lvl w:ilvl="0">
       <w:start w:val="1"/>
@@ -1453,25 +1611,34 @@
       <w:lvlText w:val="%1."/>
       <w:lvlJc w:val="left"/>
       <w:pPr>
-        <w:ind w:left="720" w:hanging="480"/>
+        <w:tabs>
+          <w:tab w:val="num" w:pos="0"/>
+        </w:tabs>
+        <w:ind w:left="480" w:hanging="480"/>
       </w:pPr>
     </w:lvl>
     <w:lvl w:ilvl="1">
       <w:start w:val="1"/>
-      <w:numFmt w:val="decimal"/>
+      <w:numFmt w:val="lowerLetter"/>
       <w:lvlText w:val="%2."/>
       <w:lvlJc w:val="left"/>
       <w:pPr>
-        <w:ind w:left="1440" w:hanging="480"/>
+        <w:tabs>
+          <w:tab w:val="num" w:pos="720"/>
+        </w:tabs>
+        <w:ind w:left="1200" w:hanging="480"/>
       </w:pPr>
     </w:lvl>
     <w:lvl w:ilvl="2">
       <w:start w:val="1"/>
-      <w:numFmt w:val="decimal"/>
+      <w:numFmt w:val="lowerRoman"/>
       <w:lvlText w:val="%3."/>
       <w:lvlJc w:val="left"/>
       <w:pPr>
-        <w:ind w:left="2160" w:hanging="480"/>
+        <w:tabs>
+          <w:tab w:val="num" w:pos="1440"/>
+        </w:tabs>
+        <w:ind w:left="1920" w:hanging="480"/>
       </w:pPr>
     </w:lvl>
     <w:lvl w:ilvl="3">
@@ -1480,25 +1647,34 @@
       <w:lvlText w:val="%4."/>
       <w:lvlJc w:val="left"/>
       <w:pPr>
-        <w:ind w:left="2880" w:hanging="480"/>
+        <w:tabs>
+          <w:tab w:val="num" w:pos="2160"/>
+        </w:tabs>
+        <w:ind w:left="2640" w:hanging="480"/>
       </w:pPr>
     </w:lvl>
     <w:lvl w:ilvl="4">
       <w:start w:val="1"/>
-      <w:numFmt w:val="decimal"/>
+      <w:numFmt w:val="lowerLetter"/>
       <w:lvlText w:val="%5."/>
       <w:lvlJc w:val="left"/>
       <w:pPr>
-        <w:ind w:left="3600" w:hanging="480"/>
+        <w:tabs>
+          <w:tab w:val="num" w:pos="2880"/>
+        </w:tabs>
+        <w:ind w:left="3360" w:hanging="480"/>
       </w:pPr>
     </w:lvl>
     <w:lvl w:ilvl="5">
       <w:start w:val="1"/>
-      <w:numFmt w:val="decimal"/>
+      <w:numFmt w:val="lowerRoman"/>
       <w:lvlText w:val="%6."/>
       <w:lvlJc w:val="left"/>
       <w:pPr>
-        <w:ind w:left="4320" w:hanging="480"/>
+        <w:tabs>
+          <w:tab w:val="num" w:pos="3600"/>
+        </w:tabs>
+        <w:ind w:left="4080" w:hanging="480"/>
       </w:pPr>
     </w:lvl>
     <w:lvl w:ilvl="6">
@@ -1507,37 +1683,49 @@
       <w:lvlText w:val="%7."/>
       <w:lvlJc w:val="left"/>
       <w:pPr>
-        <w:ind w:left="5040" w:hanging="480"/>
+        <w:tabs>
+          <w:tab w:val="num" w:pos="4320"/>
+        </w:tabs>
+        <w:ind w:left="4800" w:hanging="480"/>
       </w:pPr>
     </w:lvl>
     <w:lvl w:ilvl="7">
       <w:start w:val="1"/>
-      <w:numFmt w:val="decimal"/>
+      <w:numFmt w:val="lowerLetter"/>
       <w:lvlText w:val="%8."/>
       <w:lvlJc w:val="left"/>
       <w:pPr>
-        <w:ind w:left="5760" w:hanging="480"/>
+        <w:tabs>
+          <w:tab w:val="num" w:pos="5040"/>
+        </w:tabs>
+        <w:ind w:left="5520" w:hanging="480"/>
       </w:pPr>
     </w:lvl>
     <w:lvl w:ilvl="8">
       <w:start w:val="1"/>
-      <w:numFmt w:val="decimal"/>
+      <w:numFmt w:val="lowerRoman"/>
       <w:lvlText w:val="%9."/>
       <w:lvlJc w:val="left"/>
       <w:pPr>
-        <w:ind w:left="6480" w:hanging="480"/>
+        <w:tabs>
+          <w:tab w:val="num" w:pos="5760"/>
+        </w:tabs>
+        <w:ind w:left="6240" w:hanging="480"/>
       </w:pPr>
     </w:lvl>
   </w:abstractNum>
   <w:abstractNum w:abstractNumId="991">
-    <w:nsid w:val="A991"/>
+    <w:nsid w:val="71315dca"/>
     <w:multiLevelType w:val="multilevel"/>
     <w:lvl w:ilvl="0">
       <w:numFmt w:val="bullet"/>
       <w:lvlText w:val="•"/>
       <w:lvlJc w:val="left"/>
       <w:pPr>
-        <w:ind w:left="720" w:hanging="480"/>
+        <w:tabs>
+          <w:tab w:val="num" w:pos="0"/>
+        </w:tabs>
+        <w:ind w:left="480" w:hanging="480"/>
       </w:pPr>
     </w:lvl>
     <w:lvl w:ilvl="1">
@@ -1545,7 +1733,10 @@
       <w:lvlText w:val="–"/>
       <w:lvlJc w:val="left"/>
       <w:pPr>
-        <w:ind w:left="1440" w:hanging="480"/>
+        <w:tabs>
+          <w:tab w:val="num" w:pos="720"/>
+        </w:tabs>
+        <w:ind w:left="1200" w:hanging="480"/>
       </w:pPr>
     </w:lvl>
     <w:lvl w:ilvl="2">
@@ -1553,7 +1744,10 @@
       <w:lvlText w:val="•"/>
       <w:lvlJc w:val="left"/>
       <w:pPr>
-        <w:ind w:left="2160" w:hanging="480"/>
+        <w:tabs>
+          <w:tab w:val="num" w:pos="1440"/>
+        </w:tabs>
+        <w:ind w:left="1920" w:hanging="480"/>
       </w:pPr>
     </w:lvl>
     <w:lvl w:ilvl="3">
@@ -1561,7 +1755,10 @@
       <w:lvlText w:val="–"/>
       <w:lvlJc w:val="left"/>
       <w:pPr>
-        <w:ind w:left="2880" w:hanging="480"/>
+        <w:tabs>
+          <w:tab w:val="num" w:pos="2160"/>
+        </w:tabs>
+        <w:ind w:left="2640" w:hanging="480"/>
       </w:pPr>
     </w:lvl>
     <w:lvl w:ilvl="4">
@@ -1569,7 +1766,10 @@
       <w:lvlText w:val="•"/>
       <w:lvlJc w:val="left"/>
       <w:pPr>
-        <w:ind w:left="3600" w:hanging="480"/>
+        <w:tabs>
+          <w:tab w:val="num" w:pos="2880"/>
+        </w:tabs>
+        <w:ind w:left="3360" w:hanging="480"/>
       </w:pPr>
     </w:lvl>
     <w:lvl w:ilvl="5">
@@ -1577,7 +1777,10 @@
       <w:lvlText w:val="–"/>
       <w:lvlJc w:val="left"/>
       <w:pPr>
-        <w:ind w:left="4320" w:hanging="480"/>
+        <w:tabs>
+          <w:tab w:val="num" w:pos="3600"/>
+        </w:tabs>
+        <w:ind w:left="4080" w:hanging="480"/>
       </w:pPr>
     </w:lvl>
     <w:lvl w:ilvl="6">
@@ -1585,7 +1788,10 @@
       <w:lvlText w:val="•"/>
       <w:lvlJc w:val="left"/>
       <w:pPr>
-        <w:ind w:left="5040" w:hanging="480"/>
+        <w:tabs>
+          <w:tab w:val="num" w:pos="4320"/>
+        </w:tabs>
+        <w:ind w:left="4800" w:hanging="480"/>
       </w:pPr>
     </w:lvl>
     <w:lvl w:ilvl="7">
@@ -1593,7 +1799,10 @@
       <w:lvlText w:val="–"/>
       <w:lvlJc w:val="left"/>
       <w:pPr>
-        <w:ind w:left="5760" w:hanging="480"/>
+        <w:tabs>
+          <w:tab w:val="num" w:pos="5040"/>
+        </w:tabs>
+        <w:ind w:left="5520" w:hanging="480"/>
       </w:pPr>
     </w:lvl>
     <w:lvl w:ilvl="8">
@@ -1601,7 +1810,10 @@
       <w:lvlText w:val="•"/>
       <w:lvlJc w:val="left"/>
       <w:pPr>
-        <w:ind w:left="6480" w:hanging="480"/>
+        <w:tabs>
+          <w:tab w:val="num" w:pos="5760"/>
+        </w:tabs>
+        <w:ind w:left="6240" w:hanging="480"/>
       </w:pPr>
     </w:lvl>
   </w:abstractNum>
@@ -1609,7 +1821,7 @@
     <w:abstractNumId w:val="990"/>
   </w:num>
   <w:num w:numId="1001">
-    <w:abstractNumId w:val="99411"/>
+    <w:abstractNumId w:val="99211"/>
     <w:lvlOverride w:ilvl="0">
       <w:startOverride w:val="1"/>
     </w:lvlOverride>
@@ -1652,10 +1864,10 @@
   <w:docDefaults>
     <w:rPrDefault>
       <w:rPr>
-        <w:rFonts w:asciiTheme="minorHAnsi" w:cstheme="minorBidi" w:eastAsiaTheme="minorHAnsi" w:hAnsiTheme="minorHAnsi"/>
+        <w:rFonts w:asciiTheme="minorHAnsi" w:eastAsiaTheme="minorHAnsi" w:hAnsiTheme="minorHAnsi" w:cstheme="minorBidi"/>
         <w:sz w:val="24"/>
         <w:szCs w:val="24"/>
-        <w:lang w:bidi="ar-SA" w:eastAsia="en-US" w:val="en-US"/>
+        <w:lang w:val="en-US" w:eastAsia="en-US" w:bidi="ar-SA"/>
       </w:rPr>
     </w:rPrDefault>
     <w:pPrDefault>
@@ -1664,35 +1876,35 @@
       </w:pPr>
     </w:pPrDefault>
   </w:docDefaults>
-  <w:latentStyles w:count="276" w:defLockedState="0" w:defQFormat="0" w:defSemiHidden="0" w:defUIPriority="0" w:defUnhideWhenUsed="0"/>
-  <w:style w:default="1" w:styleId="Normal" w:type="paragraph">
+  <w:latentStyles w:defLockedState="0" w:defUIPriority="0" w:defSemiHidden="0" w:defUnhideWhenUsed="0" w:defQFormat="0" w:count="276"/>
+  <w:style w:type="paragraph" w:default="1" w:styleId="Normal">
     <w:name w:val="Normal"/>
     <w:qFormat/>
   </w:style>
-  <w:style w:styleId="BodyText" w:type="paragraph">
+  <w:style w:type="paragraph" w:styleId="BodyText">
     <w:name w:val="Body Text"/>
     <w:basedOn w:val="Normal"/>
     <w:link w:val="BodyTextChar"/>
     <w:pPr>
-      <w:spacing w:after="180" w:before="180"/>
+      <w:spacing w:before="180" w:after="180"/>
     </w:pPr>
     <w:qFormat/>
   </w:style>
-  <w:style w:customStyle="1" w:styleId="FirstParagraph" w:type="paragraph">
+  <w:style w:type="paragraph" w:customStyle="1" w:styleId="FirstParagraph">
     <w:name w:val="First Paragraph"/>
     <w:basedOn w:val="BodyText"/>
     <w:next w:val="BodyText"/>
     <w:qFormat/>
   </w:style>
-  <w:style w:customStyle="1" w:styleId="Compact" w:type="paragraph">
+  <w:style w:type="paragraph" w:customStyle="1" w:styleId="Compact">
     <w:name w:val="Compact"/>
     <w:basedOn w:val="BodyText"/>
     <w:qFormat/>
     <w:pPr>
-      <w:spacing w:after="36" w:before="36"/>
+      <w:spacing w:before="36" w:after="36"/>
     </w:pPr>
   </w:style>
-  <w:style w:styleId="Title" w:type="paragraph">
+  <w:style w:type="paragraph" w:styleId="Title">
     <w:name w:val="Title"/>
     <w:basedOn w:val="Normal"/>
     <w:next w:val="BodyText"/>
@@ -1700,19 +1912,19 @@
     <w:pPr>
       <w:keepNext/>
       <w:keepLines/>
-      <w:spacing w:after="240" w:before="480"/>
+      <w:spacing w:before="480" w:after="240"/>
       <w:jc w:val="center"/>
     </w:pPr>
     <w:rPr>
-      <w:rFonts w:asciiTheme="majorHAnsi" w:cstheme="majorBidi" w:eastAsiaTheme="majorEastAsia" w:hAnsiTheme="majorHAnsi"/>
+      <w:rFonts w:asciiTheme="majorHAnsi" w:eastAsiaTheme="majorEastAsia" w:hAnsiTheme="majorHAnsi" w:cstheme="majorBidi"/>
       <w:b/>
       <w:bCs/>
-      <w:color w:themeColor="accent1" w:themeShade="B5" w:val="345A8A"/>
+      <w:color w:val="345A8A" w:themeColor="accent1" w:themeShade="B5"/>
       <w:sz w:val="36"/>
       <w:szCs w:val="36"/>
     </w:rPr>
   </w:style>
-  <w:style w:styleId="Subtitle" w:type="paragraph">
+  <w:style w:type="paragraph" w:styleId="Subtitle">
     <w:name w:val="Subtitle"/>
     <w:basedOn w:val="Title"/>
     <w:next w:val="BodyText"/>
@@ -1720,7 +1932,7 @@
     <w:pPr>
       <w:keepNext/>
       <w:keepLines/>
-      <w:spacing w:after="240" w:before="240"/>
+      <w:spacing w:before="240" w:after="240"/>
       <w:jc w:val="center"/>
     </w:pPr>
     <w:rPr>
@@ -1728,7 +1940,7 @@
       <w:szCs w:val="30"/>
     </w:rPr>
   </w:style>
-  <w:style w:customStyle="1" w:styleId="Author" w:type="paragraph">
+  <w:style w:type="paragraph" w:customStyle="1" w:styleId="Author">
     <w:name w:val="Author"/>
     <w:next w:val="BodyText"/>
     <w:qFormat/>
@@ -1738,7 +1950,7 @@
       <w:jc w:val="center"/>
     </w:pPr>
   </w:style>
-  <w:style w:styleId="Date" w:type="paragraph">
+  <w:style w:type="paragraph" w:styleId="Date">
     <w:name w:val="Date"/>
     <w:next w:val="BodyText"/>
     <w:qFormat/>
@@ -1748,26 +1960,7 @@
       <w:jc w:val="center"/>
     </w:pPr>
   </w:style>
-  <w:style w:customStyle="1" w:styleId="AbstractTitle" w:type="paragraph">
-    <w:name w:val="Abstract Title"/>
-    <w:basedOn w:val="Normal"/>
-    <w:next w:val="Abstract"/>
-    <w:qFormat/>
-    <w:pPr>
-      <w:keepNext/>
-      <w:keepLines/>
-      <w:jc w:val="center"/>
-      <w:spacing w:after="0" w:before="300"/>
-    </w:pPr>
-    <w:rPr>
-      <w:sz w:val="20"/>
-      <w:szCs w:val="20"/>
-      <w:b/>
-      <w:color w:val="345A8A"/>
-      &gt;
-    </w:rPr>
-  </w:style>
-  <w:style w:customStyle="1" w:styleId="Abstract" w:type="paragraph">
+  <w:style w:type="paragraph" w:customStyle="1" w:styleId="Abstract">
     <w:name w:val="Abstract"/>
     <w:basedOn w:val="Normal"/>
     <w:next w:val="BodyText"/>
@@ -1775,14 +1968,14 @@
     <w:pPr>
       <w:keepNext/>
       <w:keepLines/>
-      <w:spacing w:after="300" w:before="100"/>
+      <w:spacing w:before="300" w:after="300"/>
     </w:pPr>
     <w:rPr>
       <w:sz w:val="20"/>
       <w:szCs w:val="20"/>
     </w:rPr>
   </w:style>
-  <w:style w:styleId="Bibliography" w:type="paragraph">
+  <w:style w:type="paragraph" w:styleId="Bibliography">
     <w:name w:val="Bibliography"/>
     <w:basedOn w:val="Normal"/>
     <w:next w:val="Bibliography"/>
@@ -1790,7 +1983,7 @@
     <w:pPr/>
     <w:rPr/>
   </w:style>
-  <w:style w:styleId="Heading1" w:type="paragraph">
+  <w:style w:type="paragraph" w:styleId="Heading1">
     <w:name w:val="Heading 1"/>
     <w:basedOn w:val="Normal"/>
     <w:next w:val="BodyText"/>
@@ -1799,19 +1992,19 @@
     <w:pPr>
       <w:keepNext/>
       <w:keepLines/>
-      <w:spacing w:after="0" w:before="480"/>
+      <w:spacing w:before="480" w:after="0"/>
       <w:outlineLvl w:val="0"/>
     </w:pPr>
     <w:rPr>
-      <w:rFonts w:asciiTheme="majorHAnsi" w:cstheme="majorBidi" w:eastAsiaTheme="majorEastAsia" w:hAnsiTheme="majorHAnsi"/>
+      <w:rFonts w:asciiTheme="majorHAnsi" w:eastAsiaTheme="majorEastAsia" w:hAnsiTheme="majorHAnsi" w:cstheme="majorBidi"/>
       <w:b/>
       <w:bCs/>
-      <w:color w:themeColor="accent1" w:val="4F81BD"/>
+      <w:color w:val="4F81BD" w:themeColor="accent1"/>
       <w:sz w:val="32"/>
       <w:szCs w:val="32"/>
     </w:rPr>
   </w:style>
-  <w:style w:styleId="Heading2" w:type="paragraph">
+  <w:style w:type="paragraph" w:styleId="Heading2">
     <w:name w:val="Heading 2"/>
     <w:basedOn w:val="Normal"/>
     <w:next w:val="BodyText"/>
@@ -1821,19 +2014,19 @@
     <w:pPr>
       <w:keepNext/>
       <w:keepLines/>
-      <w:spacing w:after="0" w:before="200"/>
+      <w:spacing w:before="200" w:after="0"/>
       <w:outlineLvl w:val="1"/>
     </w:pPr>
     <w:rPr>
-      <w:rFonts w:asciiTheme="majorHAnsi" w:cstheme="majorBidi" w:eastAsiaTheme="majorEastAsia" w:hAnsiTheme="majorHAnsi"/>
+      <w:rFonts w:asciiTheme="majorHAnsi" w:eastAsiaTheme="majorEastAsia" w:hAnsiTheme="majorHAnsi" w:cstheme="majorBidi"/>
       <w:b/>
       <w:bCs/>
-      <w:color w:themeColor="accent1" w:val="4F81BD"/>
+      <w:color w:val="4F81BD" w:themeColor="accent1"/>
       <w:sz w:val="28"/>
       <w:szCs w:val="28"/>
     </w:rPr>
   </w:style>
-  <w:style w:styleId="Heading3" w:type="paragraph">
+  <w:style w:type="paragraph" w:styleId="Heading3">
     <w:name w:val="Heading 3"/>
     <w:basedOn w:val="Normal"/>
     <w:next w:val="BodyText"/>
@@ -1843,19 +2036,19 @@
     <w:pPr>
       <w:keepNext/>
       <w:keepLines/>
-      <w:spacing w:after="0" w:before="200"/>
+      <w:spacing w:before="200" w:after="0"/>
       <w:outlineLvl w:val="2"/>
     </w:pPr>
     <w:rPr>
-      <w:rFonts w:asciiTheme="majorHAnsi" w:cstheme="majorBidi" w:eastAsiaTheme="majorEastAsia" w:hAnsiTheme="majorHAnsi"/>
+      <w:rFonts w:asciiTheme="majorHAnsi" w:eastAsiaTheme="majorEastAsia" w:hAnsiTheme="majorHAnsi" w:cstheme="majorBidi"/>
       <w:b/>
       <w:bCs/>
-      <w:color w:themeColor="accent1" w:val="4F81BD"/>
+      <w:color w:val="4F81BD" w:themeColor="accent1"/>
       <w:sz w:val="24"/>
       <w:szCs w:val="24"/>
     </w:rPr>
   </w:style>
-  <w:style w:styleId="Heading4" w:type="paragraph">
+  <w:style w:type="paragraph" w:styleId="Heading4">
     <w:name w:val="Heading 4"/>
     <w:basedOn w:val="Normal"/>
     <w:next w:val="BodyText"/>
@@ -1865,19 +2058,19 @@
     <w:pPr>
       <w:keepNext/>
       <w:keepLines/>
-      <w:spacing w:after="0" w:before="200"/>
+      <w:spacing w:before="200" w:after="0"/>
       <w:outlineLvl w:val="3"/>
     </w:pPr>
     <w:rPr>
-      <w:rFonts w:asciiTheme="majorHAnsi" w:cstheme="majorBidi" w:eastAsiaTheme="majorEastAsia" w:hAnsiTheme="majorHAnsi"/>
+      <w:rFonts w:asciiTheme="majorHAnsi" w:eastAsiaTheme="majorEastAsia" w:hAnsiTheme="majorHAnsi" w:cstheme="majorBidi"/>
       <w:i/>
       <w:bCs/>
-      <w:color w:themeColor="accent1" w:val="4F81BD"/>
+      <w:color w:val="4F81BD" w:themeColor="accent1"/>
       <w:sz w:val="24"/>
       <w:szCs w:val="24"/>
     </w:rPr>
   </w:style>
-  <w:style w:styleId="Heading5" w:type="paragraph">
+  <w:style w:type="paragraph" w:styleId="Heading5">
     <w:name w:val="Heading 5"/>
     <w:basedOn w:val="Normal"/>
     <w:next w:val="BodyText"/>
@@ -1887,18 +2080,18 @@
     <w:pPr>
       <w:keepNext/>
       <w:keepLines/>
-      <w:spacing w:after="0" w:before="200"/>
+      <w:spacing w:before="200" w:after="0"/>
       <w:outlineLvl w:val="4"/>
     </w:pPr>
     <w:rPr>
-      <w:rFonts w:asciiTheme="majorHAnsi" w:cstheme="majorBidi" w:eastAsiaTheme="majorEastAsia" w:hAnsiTheme="majorHAnsi"/>
+      <w:rFonts w:asciiTheme="majorHAnsi" w:eastAsiaTheme="majorEastAsia" w:hAnsiTheme="majorHAnsi" w:cstheme="majorBidi"/>
       <w:iCs/>
-      <w:color w:themeColor="accent1" w:val="4F81BD"/>
+      <w:color w:val="4F81BD" w:themeColor="accent1"/>
       <w:sz w:val="24"/>
       <w:szCs w:val="24"/>
     </w:rPr>
   </w:style>
-  <w:style w:styleId="Heading6" w:type="paragraph">
+  <w:style w:type="paragraph" w:styleId="Heading6">
     <w:name w:val="Heading 6"/>
     <w:basedOn w:val="Normal"/>
     <w:next w:val="BodyText"/>
@@ -1908,17 +2101,17 @@
     <w:pPr>
       <w:keepNext/>
       <w:keepLines/>
-      <w:spacing w:after="0" w:before="200"/>
+      <w:spacing w:before="200" w:after="0"/>
       <w:outlineLvl w:val="5"/>
     </w:pPr>
     <w:rPr>
-      <w:rFonts w:asciiTheme="majorHAnsi" w:cstheme="majorBidi" w:eastAsiaTheme="majorEastAsia" w:hAnsiTheme="majorHAnsi"/>
-      <w:color w:themeColor="accent1" w:val="4F81BD"/>
+      <w:rFonts w:asciiTheme="majorHAnsi" w:eastAsiaTheme="majorEastAsia" w:hAnsiTheme="majorHAnsi" w:cstheme="majorBidi"/>
+      <w:color w:val="4F81BD" w:themeColor="accent1"/>
       <w:sz w:val="24"/>
       <w:szCs w:val="24"/>
     </w:rPr>
   </w:style>
-  <w:style w:styleId="Heading7" w:type="paragraph">
+  <w:style w:type="paragraph" w:styleId="Heading7">
     <w:name w:val="Heading 7"/>
     <w:basedOn w:val="Normal"/>
     <w:next w:val="BodyText"/>
@@ -1928,17 +2121,17 @@
     <w:pPr>
       <w:keepNext/>
       <w:keepLines/>
-      <w:spacing w:after="0" w:before="200"/>
+      <w:spacing w:before="200" w:after="0"/>
       <w:outlineLvl w:val="6"/>
     </w:pPr>
     <w:rPr>
-      <w:rFonts w:asciiTheme="majorHAnsi" w:cstheme="majorBidi" w:eastAsiaTheme="majorEastAsia" w:hAnsiTheme="majorHAnsi"/>
-      <w:color w:themeColor="accent1" w:val="4F81BD"/>
+      <w:rFonts w:asciiTheme="majorHAnsi" w:eastAsiaTheme="majorEastAsia" w:hAnsiTheme="majorHAnsi" w:cstheme="majorBidi"/>
+      <w:color w:val="4F81BD" w:themeColor="accent1"/>
       <w:sz w:val="24"/>
       <w:szCs w:val="24"/>
     </w:rPr>
   </w:style>
-  <w:style w:styleId="Heading8" w:type="paragraph">
+  <w:style w:type="paragraph" w:styleId="Heading8">
     <w:name w:val="Heading 8"/>
     <w:basedOn w:val="Normal"/>
     <w:next w:val="BodyText"/>
@@ -1948,17 +2141,17 @@
     <w:pPr>
       <w:keepNext/>
       <w:keepLines/>
-      <w:spacing w:after="0" w:before="200"/>
+      <w:spacing w:before="200" w:after="0"/>
       <w:outlineLvl w:val="7"/>
     </w:pPr>
     <w:rPr>
-      <w:rFonts w:asciiTheme="majorHAnsi" w:cstheme="majorBidi" w:eastAsiaTheme="majorEastAsia" w:hAnsiTheme="majorHAnsi"/>
-      <w:color w:themeColor="accent1" w:val="4F81BD"/>
+      <w:rFonts w:asciiTheme="majorHAnsi" w:eastAsiaTheme="majorEastAsia" w:hAnsiTheme="majorHAnsi" w:cstheme="majorBidi"/>
+      <w:color w:val="4F81BD" w:themeColor="accent1"/>
       <w:sz w:val="24"/>
       <w:szCs w:val="24"/>
     </w:rPr>
   </w:style>
-  <w:style w:styleId="Heading9" w:type="paragraph">
+  <w:style w:type="paragraph" w:styleId="Heading9">
     <w:name w:val="Heading 9"/>
     <w:basedOn w:val="Normal"/>
     <w:next w:val="BodyText"/>
@@ -1968,17 +2161,17 @@
     <w:pPr>
       <w:keepNext/>
       <w:keepLines/>
-      <w:spacing w:after="0" w:before="200"/>
+      <w:spacing w:before="200" w:after="0"/>
       <w:outlineLvl w:val="8"/>
     </w:pPr>
     <w:rPr>
-      <w:rFonts w:asciiTheme="majorHAnsi" w:cstheme="majorBidi" w:eastAsiaTheme="majorEastAsia" w:hAnsiTheme="majorHAnsi"/>
-      <w:color w:themeColor="accent1" w:val="4F81BD"/>
+      <w:rFonts w:asciiTheme="majorHAnsi" w:eastAsiaTheme="majorEastAsia" w:hAnsiTheme="majorHAnsi" w:cstheme="majorBidi"/>
+      <w:color w:val="4F81BD" w:themeColor="accent1"/>
       <w:sz w:val="24"/>
       <w:szCs w:val="24"/>
     </w:rPr>
   </w:style>
-  <w:style w:styleId="BlockText" w:type="paragraph">
+  <w:style w:type="paragraph" w:styleId="BlockText">
     <w:name w:val="Block Text"/>
     <w:basedOn w:val="BodyText"/>
     <w:next w:val="BodyText"/>
@@ -1986,11 +2179,11 @@
     <w:unhideWhenUsed/>
     <w:qFormat/>
     <w:pPr>
-      <w:spacing w:after="100" w:before="100"/>
+      <w:spacing w:before="100" w:after="100"/>
       <w:ind w:firstLine="0" w:left="480" w:right="480"/>
     </w:pPr>
   </w:style>
-  <w:style w:styleId="FootnoteText" w:type="paragraph">
+  <w:style w:type="paragraph" w:styleId="FootnoteText">
     <w:name w:val="Footnote Text"/>
     <w:basedOn w:val="Normal"/>
     <w:next w:val="FootnoteText"/>
@@ -1998,43 +2191,28 @@
     <w:unhideWhenUsed/>
     <w:qFormat/>
   </w:style>
-  <w:style w:default="1" w:styleId="DefaultParagraphFont" w:type="character">
+  <w:style w:type="character" w:default="1" w:styleId="DefaultParagraphFont">
     <w:name w:val="Default Paragraph Font"/>
     <w:semiHidden/>
     <w:unhideWhenUsed/>
   </w:style>
-  <w:style w:default="1" w:styleId="Table" w:type="table">
+  <w:style w:type="table" w:default="1" w:styleId="Table">
     <w:name w:val="Table"/>
     <w:basedOn w:val="TableNormal"/>
     <w:semiHidden/>
     <w:unhideWhenUsed/>
     <w:qFormat/>
     <w:tblPr>
-      <w:tblInd w:type="dxa" w:w="0"/>
+      <w:tblInd w:w="0" w:type="dxa"/>
       <w:tblCellMar>
-        <w:top w:type="dxa" w:w="0"/>
-        <w:left w:type="dxa" w:w="108"/>
-        <w:bottom w:type="dxa" w:w="0"/>
-        <w:right w:type="dxa" w:w="108"/>
+        <w:top w:w="0" w:type="dxa"/>
+        <w:left w:w="108" w:type="dxa"/>
+        <w:bottom w:w="0" w:type="dxa"/>
+        <w:right w:w="108" w:type="dxa"/>
       </w:tblCellMar>
     </w:tblPr>
-    <w:tblStylePr w:type="firstRow">
-      <w:tblPr>
-        <w:jc w:val="left"/>
-        <w:tblInd w:type="dxa" w:w="0"/>
-      </w:tblPr>
-      <w:trPr>
-        <w:jc w:val="left"/>
-      </w:trPr>
-      <w:tcPr>
-        <w:vAlign w:val="bottom"/>
-        <w:tcBorders>
-          <w:bottom w:val="single"/>
-        </w:tcBorders>
-      </w:tcPr>
-    </w:tblStylePr>
-  </w:style>
-  <w:style w:customStyle="1" w:styleId="DefinitionTerm" w:type="paragraph">
+  </w:style>
+  <w:style w:type="paragraph" w:customStyle="1" w:styleId="DefinitionTerm">
     <w:name w:val="Definition Term"/>
     <w:basedOn w:val="Normal"/>
     <w:next w:val="Definition"/>
@@ -2047,49 +2225,49 @@
       <w:b/>
     </w:rPr>
   </w:style>
-  <w:style w:customStyle="1" w:styleId="Definition" w:type="paragraph">
+  <w:style w:type="paragraph" w:customStyle="1" w:styleId="Definition">
     <w:name w:val="Definition"/>
     <w:basedOn w:val="Normal"/>
   </w:style>
-  <w:style w:styleId="Caption" w:type="paragraph">
+  <w:style w:type="paragraph" w:styleId="Caption">
     <w:name w:val="Caption"/>
     <w:basedOn w:val="Normal"/>
     <w:link w:val="BodyTextChar"/>
     <w:pPr>
-      <w:spacing w:after="120" w:before="0"/>
+      <w:spacing w:before="0" w:after="120"/>
     </w:pPr>
     <w:rPr>
       <w:i/>
     </w:rPr>
   </w:style>
-  <w:style w:customStyle="1" w:styleId="TableCaption" w:type="paragraph">
+  <w:style w:type="paragraph" w:customStyle="1" w:styleId="TableCaption">
     <w:name w:val="Table Caption"/>
     <w:basedOn w:val="Caption"/>
     <w:pPr>
       <w:keepNext/>
     </w:pPr>
   </w:style>
-  <w:style w:customStyle="1" w:styleId="ImageCaption" w:type="paragraph">
+  <w:style w:type="paragraph" w:customStyle="1" w:styleId="ImageCaption">
     <w:name w:val="Image Caption"/>
     <w:basedOn w:val="Caption"/>
   </w:style>
-  <w:style w:customStyle="1" w:styleId="Figure" w:type="paragraph">
+  <w:style w:type="paragraph" w:customStyle="1" w:styleId="Figure">
     <w:name w:val="Figure"/>
     <w:basedOn w:val="Normal"/>
   </w:style>
-  <w:style w:customStyle="1" w:styleId="CaptionedFigure" w:type="paragraph">
+  <w:style w:type="paragraph" w:customStyle="1" w:styleId="CaptionedFigure">
     <w:name w:val="Captioned Figure"/>
     <w:basedOn w:val="Figure"/>
     <w:pPr>
       <w:keepNext/>
     </w:pPr>
   </w:style>
-  <w:style w:customStyle="1" w:styleId="BodyTextChar" w:type="character">
+  <w:style w:type="character" w:customStyle="1" w:styleId="BodyTextChar">
     <w:name w:val="Body Text Char"/>
     <w:basedOn w:val="DefaultParagraphFont"/>
     <w:link w:val="BodyText"/>
   </w:style>
-  <w:style w:customStyle="1" w:styleId="VerbatimChar" w:type="character">
+  <w:style w:type="character" w:customStyle="1" w:styleId="VerbatimChar">
     <w:name w:val="Verbatim Char"/>
     <w:basedOn w:val="BodyTextChar"/>
     <w:rPr>
@@ -2097,25 +2275,21 @@
       <w:sz w:val="22"/>
     </w:rPr>
   </w:style>
-  <w:style w:customStyle="1" w:styleId="SectionNumber" w:type="character">
-    <w:name w:val="Section Number"/>
-    <w:basedOn w:val="BodyTextChar"/>
-  </w:style>
-  <w:style w:styleId="FootnoteReference" w:type="character">
+  <w:style w:type="character" w:styleId="FootnoteReference">
     <w:name w:val="Footnote Reference"/>
     <w:basedOn w:val="BodyTextChar"/>
     <w:rPr>
       <w:vertAlign w:val="superscript"/>
     </w:rPr>
   </w:style>
-  <w:style w:styleId="Hyperlink" w:type="character">
+  <w:style w:type="character" w:styleId="Hyperlink">
     <w:name w:val="Hyperlink"/>
     <w:basedOn w:val="BodyTextChar"/>
     <w:rPr>
-      <w:color w:themeColor="accent1" w:val="4F81BD"/>
-    </w:rPr>
-  </w:style>
-  <w:style w:styleId="TOCHeading" w:type="paragraph">
+      <w:color w:val="4F81BD" w:themeColor="accent1"/>
+    </w:rPr>
+  </w:style>
+  <w:style w:type="paragraph" w:styleId="TOCHeading">
     <w:name w:val="TOC Heading"/>
     <w:basedOn w:val="Heading1"/>
     <w:next w:val="BodyText"/>
@@ -2127,10 +2301,10 @@
       <w:outlineLvl w:val="9"/>
     </w:pPr>
     <w:rPr>
-      <w:rFonts w:asciiTheme="majorHAnsi" w:cstheme="majorBidi" w:eastAsiaTheme="majorEastAsia" w:hAnsiTheme="majorHAnsi"/>
+      <w:rFonts w:asciiTheme="majorHAnsi" w:eastAsiaTheme="majorEastAsia" w:hAnsiTheme="majorHAnsi" w:cstheme="majorBidi"/>
       <w:b w:val="0"/>
       <w:bCs w:val="0"/>
-      <w:color w:themeColor="accent1" w:themeShade="BF" w:val="365F91"/>
+      <w:color w:val="365F91" w:themeColor="accent1" w:themeShade="BF"/>
     </w:rPr>
   </w:style>
   <w:style w:type="paragraph" w:customStyle="1" w:styleId="SourceCode">
@@ -2222,10 +2396,7 @@
   <w:style w:type="character" w:customStyle="1" w:styleId="ImportTok">
     <w:name w:val="ImportTok"/>
     <w:basedOn w:val="VerbatimChar"/>
-    <w:rPr>
-      <w:color w:val="008000"/>
-      <w:b/>
-    </w:rPr>
+    <w:rPr/>
   </w:style>
   <w:style w:type="character" w:customStyle="1" w:styleId="CommentTok">
     <w:name w:val="CommentTok"/>
@@ -2300,9 +2471,7 @@
   <w:style w:type="character" w:customStyle="1" w:styleId="BuiltInTok">
     <w:name w:val="BuiltInTok"/>
     <w:basedOn w:val="VerbatimChar"/>
-    <w:rPr>
-      <w:color w:val="008000"/>
-    </w:rPr>
+    <w:rPr/>
   </w:style>
   <w:style w:type="character" w:customStyle="1" w:styleId="ExtensionTok">
     <w:name w:val="ExtensionTok"/>

</xml_diff>